<commit_message>
Firmware: reduce command buffers to fit 6 KB RAM (max. command length 15), API 1.1.1, docs rev 1.2
</commit_message>
<xml_diff>
--- a/docs/source/ATEK_RF_Modules_Programming_Manual.docx
+++ b/docs/source/ATEK_RF_Modules_Programming_Manual.docx
@@ -68,7 +68,7 @@
       </w:pPr>
       <w:r>
         <w:rPr/>
-        <w:t>Document revision 1.1  |  Python API version 1.1.0</w:t>
+        <w:t>Document revision 1.2  |  Python API version 1.1.1</w:t>
       </w:r>
     </w:p>
     <w:p>
@@ -1683,7 +1683,7 @@
       </w:pPr>
       <w:r>
         <w:rPr/>
-        <w:t>One command per line, maximum 63 characters.</w:t>
+        <w:t>One command per line, maximum 15 characters.</w:t>
       </w:r>
     </w:p>
     <w:p>

</xml_diff>